<commit_message>
Clearer answers for students: choices, ???, 5-point question, bonus fixes
- 'It should say...' offers three concrete outputs (the correct one, what
  the machine said, a plausible other) plus 'I'm not sure'; busted logs
  the options, the choice, and expected_correct
- Broken numbers show as ??? instead of NaN; Pizza Splitter says 'slices'
- Only the coding-experience question remains, as a 5-point scale (1 None
  ... 5 A whole lot); the birthday question is gone before and after
- Bonus 'find the guilty line': every answer is on screen. A wrong line
  is picked from the code; a missing check shows a gap and three candidate
  lines (Machine.fixFor replaces guiltyLine)
- Birthday bonus shows a hint: try a date that doesn't exist, or today
- Output box is about 30 letters wide so too-long names visibly overflow
- End screen: 'The AI said its tools worked perfectly. You proved it
  wrong.' when at least one bug was busted

Co-Authored-By: Claude Opus 5.5 <noreply@anthropic.com>
</commit_message>
<xml_diff>
--- a/BugHunter OnePager.docx
+++ b/BugHunter OnePager.docx
@@ -2,14 +2,236 @@
 <file path=word/document.xml><?xml version="1.0" encoding="utf-8"?>
 <w:document xmlns:wpc="http://schemas.microsoft.com/office/word/2010/wordprocessingCanvas" xmlns:mc="http://schemas.openxmlformats.org/markup-compatibility/2006" xmlns:o="urn:schemas-microsoft-com:office:office" xmlns:r="http://schemas.openxmlformats.org/officeDocument/2006/relationships" xmlns:m="http://schemas.openxmlformats.org/officeDocument/2006/math" xmlns:v="urn:schemas-microsoft-com:vml" xmlns:wp14="http://schemas.microsoft.com/office/word/2010/wordprocessingDrawing" xmlns:wp="http://schemas.openxmlformats.org/drawingml/2006/wordprocessingDrawing" xmlns:w10="urn:schemas-microsoft-com:office:word" xmlns:w="http://schemas.openxmlformats.org/wordprocessingml/2006/main" xmlns:w14="http://schemas.microsoft.com/office/word/2010/wordml" xmlns:w15="http://schemas.microsoft.com/office/word/2012/wordml" xmlns:wpg="http://schemas.microsoft.com/office/word/2010/wordprocessingGroup" xmlns:wpi="http://schemas.microsoft.com/office/word/2010/wordprocessingInk" xmlns:wne="http://schemas.microsoft.com/office/word/2006/wordml" xmlns:wps="http://schemas.microsoft.com/office/word/2010/wordprocessingShape" xmlns:w16se="http://schemas.microsoft.com/office/word/2015/wordml/symex" xmlns:w16cid="http://schemas.microsoft.com/office/word/2016/wordml/cid" xmlns:w16="http://schemas.microsoft.com/office/word/2018/wordml" xmlns:w16cex="http://schemas.microsoft.com/office/word/2018/wordml/cex" xmlns:w16sdtdh="http://schemas.microsoft.com/office/word/2020/wordml/sdtdatahash" xmlns:w16sdtfl="http://schemas.microsoft.com/office/word/2024/wordml/sdtformatlock" mc:Ignorable="w14 w15 wp14 w16se w16cid w16 w16cex w16sdtdh w16sdtfl">
   <w:body>
-    <w:p xmlns:wp14="http://schemas.microsoft.com/office/word/2010/wordml" wp14:paraId="2C078E63" wp14:textId="34C96A43">
+    <w:p xmlns:wp14="http://schemas.microsoft.com/office/word/2010/wordml" wp14:paraId="2372EB87" wp14:textId="586D8897">
+      <w:pPr>
+        <w:rPr>
+          <w:b w:val="0"/>
+          <w:bCs w:val="0"/>
+        </w:rPr>
+      </w:pPr>
       <w:r>
         <w:rPr>
           <w:b w:val="1"/>
           <w:bCs w:val="1"/>
         </w:rPr>
-        <w:t xml:space="preserve">BugHunter: </w:t>
-      </w:r>
+        <w:t>BugHunter</w:t>
+      </w:r>
+      <w:r>
+        <w:rPr>
+          <w:b w:val="1"/>
+          <w:bCs w:val="1"/>
+        </w:rPr>
+        <w:t xml:space="preserve">: </w:t>
+      </w:r>
+      <w:r>
+        <w:rPr>
+          <w:b w:val="0"/>
+          <w:bCs w:val="0"/>
+        </w:rPr>
+        <w:t>Students are introduced to three AI-generated “machines” where they type input and examine th</w:t>
+      </w:r>
+      <w:r>
+        <w:rPr>
+          <w:b w:val="0"/>
+          <w:bCs w:val="0"/>
+        </w:rPr>
+        <w:t xml:space="preserve">e output with the goal of finding the edge cases. </w:t>
+      </w:r>
+      <w:r>
+        <w:rPr>
+          <w:b w:val="0"/>
+          <w:bCs w:val="0"/>
+        </w:rPr>
+        <w:t xml:space="preserve">While exploring the input and output, </w:t>
+      </w:r>
+      <w:r>
+        <w:rPr>
+          <w:b w:val="0"/>
+          <w:bCs w:val="0"/>
+        </w:rPr>
+        <w:t>student</w:t>
+      </w:r>
+      <w:r>
+        <w:rPr>
+          <w:b w:val="0"/>
+          <w:bCs w:val="0"/>
+        </w:rPr>
+        <w:t xml:space="preserve"> </w:t>
+      </w:r>
+      <w:r>
+        <w:rPr>
+          <w:b w:val="0"/>
+          <w:bCs w:val="0"/>
+        </w:rPr>
+        <w:t>identify</w:t>
+      </w:r>
+      <w:r>
+        <w:rPr>
+          <w:b w:val="0"/>
+          <w:bCs w:val="0"/>
+        </w:rPr>
+        <w:t xml:space="preserve"> bugs and make corrections to the ai. The machines transition from number input for the first two machines, to text input for the third to measure transfer. Bugs found are </w:t>
+      </w:r>
+      <w:r>
+        <w:rPr>
+          <w:b w:val="0"/>
+          <w:bCs w:val="0"/>
+        </w:rPr>
+        <w:t xml:space="preserve">classified as wrong type, empty, zero, out of range, boundary, </w:t>
+      </w:r>
+      <w:r>
+        <w:rPr>
+          <w:b w:val="0"/>
+          <w:bCs w:val="0"/>
+        </w:rPr>
+        <w:t xml:space="preserve">or </w:t>
+      </w:r>
+      <w:r>
+        <w:rPr>
+          <w:b w:val="0"/>
+          <w:bCs w:val="0"/>
+        </w:rPr>
+        <w:t>too long</w:t>
+      </w:r>
+      <w:r>
+        <w:rPr>
+          <w:b w:val="0"/>
+          <w:bCs w:val="0"/>
+        </w:rPr>
+        <w:t>.</w:t>
+      </w:r>
+      <w:r>
+        <w:rPr>
+          <w:b w:val="0"/>
+          <w:bCs w:val="0"/>
+        </w:rPr>
+        <w:t xml:space="preserve"> As a final challenge level, the students can look at lines of code and guess which one is “guilty” for causing the bug. </w:t>
+      </w:r>
+    </w:p>
+    <w:p xmlns:wp14="http://schemas.microsoft.com/office/word/2010/wordml" wp14:paraId="5A01F74C" wp14:textId="104C834B">
+      <w:pPr>
+        <w:rPr>
+          <w:b w:val="0"/>
+          <w:bCs w:val="0"/>
+        </w:rPr>
+      </w:pPr>
+    </w:p>
+    <w:p xmlns:wp14="http://schemas.microsoft.com/office/word/2010/wordml" wp14:paraId="2C078E63" wp14:textId="463ED64F">
+      <w:pPr>
+        <w:rPr>
+          <w:b w:val="0"/>
+          <w:bCs w:val="0"/>
+        </w:rPr>
+      </w:pPr>
+      <w:r>
+        <w:rPr>
+          <w:b w:val="1"/>
+          <w:bCs w:val="1"/>
+        </w:rPr>
+        <w:t>Research Objectives:</w:t>
+      </w:r>
+      <w:r>
+        <w:rPr>
+          <w:b w:val="0"/>
+          <w:bCs w:val="0"/>
+        </w:rPr>
+        <w:t xml:space="preserve"> </w:t>
+      </w:r>
+      <w:r>
+        <w:rPr>
+          <w:b w:val="0"/>
+          <w:bCs w:val="0"/>
+        </w:rPr>
+        <w:t xml:space="preserve">examine whether students probe deliberately with edge cases, whether that improves within one session, and whether it transfers from number inputs to text inputs. </w:t>
+      </w:r>
+    </w:p>
+    <w:p>
+      <w:pPr>
+        <w:pStyle w:val="Normal"/>
+        <w:rPr>
+          <w:b w:val="0"/>
+          <w:bCs w:val="0"/>
+        </w:rPr>
+      </w:pPr>
+      <w:r>
+        <w:rPr>
+          <w:b w:val="1"/>
+          <w:bCs w:val="1"/>
+        </w:rPr>
+        <w:t xml:space="preserve">Data Collection: </w:t>
+      </w:r>
+      <w:r>
+        <w:rPr>
+          <w:b w:val="0"/>
+          <w:bCs w:val="0"/>
+        </w:rPr>
+        <w:t>BugH</w:t>
+      </w:r>
+      <w:r>
+        <w:rPr>
+          <w:b w:val="0"/>
+          <w:bCs w:val="0"/>
+        </w:rPr>
+        <w:t>u</w:t>
+      </w:r>
+      <w:r>
+        <w:rPr>
+          <w:b w:val="0"/>
+          <w:bCs w:val="0"/>
+        </w:rPr>
+        <w:t>nters</w:t>
+      </w:r>
+      <w:r>
+        <w:rPr>
+          <w:b w:val="0"/>
+          <w:bCs w:val="0"/>
+        </w:rPr>
+        <w:t xml:space="preserve"> </w:t>
+      </w:r>
+      <w:r>
+        <w:rPr>
+          <w:b w:val="0"/>
+          <w:bCs w:val="0"/>
+        </w:rPr>
+        <w:t xml:space="preserve">logs student intake information and gameplay logs locally as a CSV file. Intake data </w:t>
+      </w:r>
+      <w:r>
+        <w:rPr>
+          <w:b w:val="0"/>
+          <w:bCs w:val="0"/>
+        </w:rPr>
+        <w:t xml:space="preserve">is student’s first name and last </w:t>
+      </w:r>
+      <w:r>
+        <w:rPr>
+          <w:b w:val="0"/>
+          <w:bCs w:val="0"/>
+        </w:rPr>
+        <w:t>initial</w:t>
+      </w:r>
+      <w:r>
+        <w:rPr>
+          <w:b w:val="0"/>
+          <w:bCs w:val="0"/>
+        </w:rPr>
+        <w:t>, and gameplay logs include timestamps, event logs (buttons clicked, input typed</w:t>
+      </w:r>
+      <w:r>
+        <w:rPr>
+          <w:b w:val="0"/>
+          <w:bCs w:val="0"/>
+        </w:rPr>
+        <w:t xml:space="preserve">) </w:t>
+      </w:r>
+    </w:p>
+    <w:p>
+      <w:pPr>
+        <w:pStyle w:val="Normal"/>
+        <w:rPr>
+          <w:b w:val="0"/>
+          <w:bCs w:val="0"/>
+        </w:rPr>
+      </w:pPr>
     </w:p>
     <w:sectPr>
       <w:pgSz w:w="12240" w:h="15840" w:orient="portrait"/>

</xml_diff>

<commit_message>
Spec v3 stage 4: label step in Busted!, new feedback wording
- Busted! is now two short steps: 'It should say...' (concrete answers,
  kept), then 'What kind of input broke it?' with zero, blank, negative,
  too big, exactly the limit, wrong kind, something else
- busted logs student_label, classifier_label and label_agreement; the
  classifier's label comes from the bug kind, or from the input's own
  kind for false alarms (null for an ordinary input)
- Feedback: real bug 'Yes, a Zero bug!' or 'We'd call that a Negative bug';
  false alarm 'That one works the way the request says. Keep testing!';
  debatable 'The request doesn't say. Good thinking: what should it do?'
- Counter still counts one bug per kind per machine

Co-Authored-By: Claude Opus 5.5 <noreply@anthropic.com>
</commit_message>
<xml_diff>
--- a/BugHunter OnePager.docx
+++ b/BugHunter OnePager.docx
@@ -49,48 +49,159 @@
         <w:t xml:space="preserve"> graders) test AI-built software</w:t>
       </w:r>
     </w:p>
-    <w:p xmlns:wp14="http://schemas.microsoft.com/office/word/2010/wordml" wp14:paraId="25090023" wp14:textId="1663B7A4">
+    <w:p xmlns:wp14="http://schemas.microsoft.com/office/word/2010/wordml" wp14:paraId="25090023" wp14:textId="7D83A480">
       <w:pPr>
+        <w:pStyle w:val="Normal"/>
+        <w:suppressLineNumbers w:val="0"/>
+        <w:bidi w:val="0"/>
+        <w:spacing w:before="0" w:beforeAutospacing="off" w:after="160" w:afterAutospacing="off" w:line="279" w:lineRule="auto"/>
+        <w:ind w:left="0" w:right="0"/>
+        <w:jc w:val="left"/>
+        <w:rPr>
+          <w:b w:val="0"/>
+          <w:bCs w:val="0"/>
+        </w:rPr>
+      </w:pPr>
+      <w:r>
         <w:rPr>
           <w:b w:val="1"/>
           <w:bCs w:val="1"/>
         </w:rPr>
-      </w:pPr>
+        <w:t xml:space="preserve">Overview: </w:t>
+      </w:r>
+      <w:r>
+        <w:rPr>
+          <w:b w:val="0"/>
+          <w:bCs w:val="0"/>
+        </w:rPr>
+        <w:t>Students will have 10-15 minutes to hunt for bugs in software created by AI.</w:t>
+      </w:r>
+      <w:r>
+        <w:rPr>
+          <w:b w:val="0"/>
+          <w:bCs w:val="0"/>
+        </w:rPr>
+        <w:t xml:space="preserve"> They will </w:t>
+      </w:r>
+      <w:r>
+        <w:rPr>
+          <w:b w:val="0"/>
+          <w:bCs w:val="0"/>
+        </w:rPr>
+        <w:t xml:space="preserve">be </w:t>
+      </w:r>
+      <w:r>
+        <w:rPr>
+          <w:b w:val="0"/>
+          <w:bCs w:val="0"/>
+        </w:rPr>
+        <w:t xml:space="preserve">exploring three “machines”, </w:t>
+      </w:r>
+      <w:r>
+        <w:rPr>
+          <w:b w:val="0"/>
+          <w:bCs w:val="0"/>
+        </w:rPr>
+        <w:t xml:space="preserve">looking </w:t>
+      </w:r>
+      <w:r>
+        <w:rPr>
+          <w:b w:val="0"/>
+          <w:bCs w:val="0"/>
+        </w:rPr>
+        <w:t xml:space="preserve">for edge cases for inputs, such as zeros, black entries, boundary values, or wrong input type. Half of the students will </w:t>
+      </w:r>
+      <w:r>
+        <w:rPr>
+          <w:b w:val="0"/>
+          <w:bCs w:val="0"/>
+        </w:rPr>
+        <w:t>receive</w:t>
+      </w:r>
+      <w:r>
+        <w:rPr>
+          <w:b w:val="0"/>
+          <w:bCs w:val="0"/>
+        </w:rPr>
+        <w:t xml:space="preserve"> </w:t>
+      </w:r>
+      <w:r>
+        <w:rPr>
+          <w:b w:val="0"/>
+          <w:bCs w:val="0"/>
+        </w:rPr>
+        <w:t>instant</w:t>
+      </w:r>
+      <w:r>
+        <w:rPr>
+          <w:b w:val="0"/>
+          <w:bCs w:val="0"/>
+        </w:rPr>
+        <w:t xml:space="preserve"> feedback on the bugs they missed, before moving to the next challenge, and the other h</w:t>
+      </w:r>
+      <w:r>
+        <w:rPr>
+          <w:b w:val="0"/>
+          <w:bCs w:val="0"/>
+        </w:rPr>
+        <w:t>alf</w:t>
+      </w:r>
+      <w:r>
+        <w:rPr>
+          <w:b w:val="0"/>
+          <w:bCs w:val="0"/>
+        </w:rPr>
+        <w:t xml:space="preserve"> will </w:t>
+      </w:r>
+      <w:r>
+        <w:rPr>
+          <w:b w:val="0"/>
+          <w:bCs w:val="0"/>
+        </w:rPr>
+        <w:t>receive</w:t>
+      </w:r>
+      <w:r>
+        <w:rPr>
+          <w:b w:val="0"/>
+          <w:bCs w:val="0"/>
+        </w:rPr>
+        <w:t xml:space="preserve"> the same feedback at the conclusion of </w:t>
+      </w:r>
+      <w:r>
+        <w:rPr>
+          <w:b w:val="0"/>
+          <w:bCs w:val="0"/>
+        </w:rPr>
+        <w:t>their</w:t>
+      </w:r>
+      <w:r>
+        <w:rPr>
+          <w:b w:val="0"/>
+          <w:bCs w:val="0"/>
+        </w:rPr>
+        <w:t xml:space="preserve"> </w:t>
+      </w:r>
+      <w:r>
+        <w:rPr>
+          <w:b w:val="0"/>
+          <w:bCs w:val="0"/>
+        </w:rPr>
+        <w:t>session</w:t>
+      </w:r>
+      <w:r>
+        <w:rPr>
+          <w:b w:val="0"/>
+          <w:bCs w:val="0"/>
+        </w:rPr>
+        <w:t xml:space="preserve">. </w:t>
+      </w:r>
+    </w:p>
+    <w:p xmlns:wp14="http://schemas.microsoft.com/office/word/2010/wordml" wp14:paraId="5A01F74C" wp14:textId="0941C3E3">
       <w:r>
         <w:rPr>
           <w:b w:val="1"/>
           <w:bCs w:val="1"/>
         </w:rPr>
-        <w:t xml:space="preserve">Overview: </w:t>
-      </w:r>
-      <w:r>
-        <w:rPr>
-          <w:b w:val="0"/>
-          <w:bCs w:val="0"/>
-        </w:rPr>
-        <w:t>Students will have 10-15 minutes to hunt for bugs in software created by AI.</w:t>
-      </w:r>
-      <w:r>
-        <w:rPr>
-          <w:b w:val="0"/>
-          <w:bCs w:val="0"/>
-        </w:rPr>
-        <w:t xml:space="preserve"> They will </w:t>
-      </w:r>
-      <w:r>
-        <w:rPr>
-          <w:b w:val="0"/>
-          <w:bCs w:val="0"/>
-        </w:rPr>
-        <w:t>be looking for edge cases for inputs, such as zeros, black entries, boundary l</w:t>
-      </w:r>
-    </w:p>
-    <w:p xmlns:wp14="http://schemas.microsoft.com/office/word/2010/wordml" wp14:paraId="5A01F74C" wp14:textId="0A374120">
-      <w:r>
-        <w:rPr>
-          <w:b w:val="1"/>
-          <w:bCs w:val="1"/>
-        </w:rPr>
         <w:t>Procedure:</w:t>
       </w:r>
       <w:r>
@@ -112,7 +223,21 @@
           <w:b w:val="0"/>
           <w:bCs w:val="0"/>
         </w:rPr>
-        <w:t>, and class period. A short tutorial explains that an AI built the apps and that the student’s job is to check them. Students then test three small apps (a savings planner, a sale-price calculator, and a jersey name printer) by typing inputs and flagging wrong outputs. Students who finish early may try a bonus app (a raffle picker).</w:t>
+        <w:t>, and class period. A short tutorial explains that an AI built the apps and that the student’s job is to check them. Students then test three small apps (a savings planner, a sale-price calculator, and a jersey name printer) by typing inputs and flagging wrong outputs. Students who finish early may try a bonus app (a raffle picker)</w:t>
+      </w:r>
+      <w:r>
+        <w:rPr>
+          <w:b w:val="0"/>
+          <w:bCs w:val="0"/>
+        </w:rPr>
+        <w:t xml:space="preserve">, </w:t>
+      </w:r>
+      <w:r>
+        <w:rPr>
+          <w:b w:val="0"/>
+          <w:bCs w:val="0"/>
+        </w:rPr>
+        <w:t>.</w:t>
       </w:r>
     </w:p>
     <w:p xmlns:wp14="http://schemas.microsoft.com/office/word/2010/wordml" wp14:paraId="2C078E63" wp14:textId="463ED64F">

</xml_diff>

<commit_message>
Spec v3 stage 5: intake questions
- The only in-tool survey items, right after login, word for word:
  I1 coding experience (Never / A little / Some / A lot, with examples) and
  I2 confidence using AI tools (never used one / not very / somewhat /
  very). survey_response logs question id, 1-based choice and text.
- Pre/post surveys happen outside the tool and join on first name, last
  initial and class period (exports will include them, staff-only).
- Bug-kind names students see now match the label choices: Blank, Wrong
  kind, Too big, Limit (so 'Wrong kind' is answered with 'a Wrong kind bug')

Co-Authored-By: Claude Opus 5.5 <noreply@anthropic.com>
</commit_message>
<xml_diff>
--- a/BugHunter OnePager.docx
+++ b/BugHunter OnePager.docx
@@ -196,7 +196,7 @@
         <w:t xml:space="preserve">. </w:t>
       </w:r>
     </w:p>
-    <w:p xmlns:wp14="http://schemas.microsoft.com/office/word/2010/wordml" wp14:paraId="5A01F74C" wp14:textId="0941C3E3">
+    <w:p xmlns:wp14="http://schemas.microsoft.com/office/word/2010/wordml" wp14:paraId="5A01F74C" wp14:textId="1A1648AF">
       <w:r>
         <w:rPr>
           <w:b w:val="1"/>
@@ -230,7 +230,21 @@
           <w:b w:val="0"/>
           <w:bCs w:val="0"/>
         </w:rPr>
-        <w:t xml:space="preserve">, </w:t>
+        <w:t xml:space="preserve">, and pseudocode </w:t>
+      </w:r>
+      <w:r>
+        <w:rPr>
+          <w:b w:val="0"/>
+          <w:bCs w:val="0"/>
+        </w:rPr>
+        <w:t>exercise</w:t>
+      </w:r>
+      <w:r>
+        <w:rPr>
+          <w:b w:val="0"/>
+          <w:bCs w:val="0"/>
+        </w:rPr>
+        <w:t xml:space="preserve"> (find the guilty line)</w:t>
       </w:r>
       <w:r>
         <w:rPr>

</xml_diff>